<commit_message>
Book 1: pace charge neutrality explanation
</commit_message>
<xml_diff>
--- a/EE - SERIES/Foundations_Book1.docx
+++ b/EE - SERIES/Foundations_Book1.docx
@@ -1263,7 +1263,13 @@
         <w:spacing w:after="200" w:line="276" w:lineRule="auto"/>
       </w:pPr>
       <w:r>
-        <w:t>It is worth pausing on just how strange this is. Gravity is the force most people build their physical intuition around, because it is the only fundamental force whose effects are obvious in daily life without any special equipment. But gravity is, by a spectacular margin, the weakest of the four fundamental forces. The only reason gravity dominates the large-scale structure of the universe — planets, stars, galaxies — is that ordinary matter is, to very high precision, electrically neutral: the positive and negative charges in any large object nearly perfectly cancel, leaving gravity, weak as it is, as the only force with nothing to cancel it out. Get that cancellation even slightly wrong — charge a balloon by rubbing it on your hair — and the electric force wins over gravity by such a wide margin that the balloon sticks to the ceiling, plainly overpowering the gravitational pull of an entire planet.</w:t>
+        <w:t>It is worth pausing on just how strange this is. Gravity is the force most people build their physical intuition around, because it is the only fundamental force whose effects are obvious in daily life without any special equipment. But gravity is, by a spectacular margin, the weakest of the four fundamental forces. The only reason gravity dominates the large-scale structure of the universe — planets, stars, galaxies — is that ordinary matter is, to very high precision, electrically neutral: the positive and negative charges in any large object nearly perfectly cancel, leaving gravity, weak as it is, as the only force with nothing to cancel it out.</w:t>
+      </w:r>
+    </w:p>
+    <w:p>
+      <w:pPr/>
+      <w:r>
+        <w:t>Get that cancellation even slightly wrong — charge a balloon by rubbing it on your hair — and the electric force wins over gravity by such a wide margin that the balloon sticks to the ceiling, plainly overpowering the gravitational pull of an entire planet.</w:t>
       </w:r>
     </w:p>
     <w:p>

</xml_diff>

<commit_message>
Book 1: qualify reader-lab radio and cell claims
</commit_message>
<xml_diff>
--- a/EE - SERIES/Foundations_Book1.docx
+++ b/EE - SERIES/Foundations_Book1.docx
@@ -483,7 +483,7 @@
         <w:spacing w:after="60"/>
       </w:pPr>
       <w:r>
-        <w:t>A LoRa radio module (868 or 915 MHz, depending on region): the voice that carries several kilometers on tens of milliwatts.</w:t>
+        <w:t>A LoRa radio module in the locally permitted sub-GHz band (often 868 or 915 MHz): the voice. With a suitable antenna and a favorable link budget, a low data rate and clear path can support links over several kilometers; actual range and lawful transmit power depend on local conditions and regional rules.</w:t>
       </w:r>
     </w:p>
     <w:p>
@@ -509,7 +509,7 @@
         <w:spacing w:after="60"/>
       </w:pPr>
       <w:r>
-        <w:t>An 18650 lithium-ion cell in a holder with a charge and protection module: the stomach. A full cell sits at 4.2 V, its nominal voltage is about 3.6 to 3.7 V, and it stores roughly 3000 mAh.</w:t>
+        <w:t>An 18650 lithium-ion cell in a holder with a protection module: the stomach. A typical cell has a nominal voltage of 3.6 to 3.7 V and charges to 4.2 V; capacity depends on the cell model (about 3000 mAh is a representative example, not a guaranteed value). Use a charger specified for the cell.</w:t>
       </w:r>
     </w:p>
     <w:p>
@@ -546,7 +546,7 @@
           <wp:inline distT="0" distB="0" distL="0" distR="0" wp14:anchorId="18445732" wp14:editId="10D1D8EE">
             <wp:extent cx="5120640" cy="3584448"/>
             <wp:effectExtent l="0" t="0" r="0" b="0"/>
-            <wp:docPr id="18" name="Picture 18" descr="A block diagram with the ESP32-S3 board in the center, labeled brain, Wi-Fi and Bluetooth LE, 12-bit ADC, 3.3 V logic. Nine parts surround it, each linked by a labeled line. Senses on the left: camera (eyes, parallel camera bus), HC-SR04 ultrasonic ranger (bat's echo, trigger and echo pins, 5 V pulse needs a divider), PIR motion sensor (warmth at a distance, one digital pin), BME280 (skin and inner ear: temperature, humidity, pressure, I2C), GPS (sense of place, UART serial). Outputs on the right: OLED display (face, I2C or SPI), servo (muscle, PWM pulse 1 to 2 ms every 20 ms), LoRa radio (voice, SPI, 868 or 915 MHz). Below: 18650 cell with protection module (stomach, 3.0 to 4.2 V)." title="Figure L.1"/>
+            <wp:docPr id="18" name="Picture 18" descr="A block diagram with the ESP32-S3 board in the center, labeled brain, Wi-Fi and Bluetooth LE, 12-bit ADC, 3.3 V logic. Nine parts surround it, each linked by a labeled line. Senses on the left: camera (eyes, parallel camera bus), HC-SR04 ultrasonic ranger (bat's echo, trigger and echo pins, 5 V pulse needs a divider), PIR motion sensor (warmth at a distance, one digital pin), BME280 (skin and inner ear: temperature, humidity, pressure, I2C), GPS (sense of place, UART serial). Outputs on the right: OLED display (face, I2C or SPI), servo (muscle, PWM pulse 1 to 2 ms every 20 ms), LoRa radio (voice, SPI, 868 or 915 MHz). Below: 18650 cell with protection module (stomach, 3.0 to 4.2 V). Conceptual kit map, not a complete wiring diagram." title="Figure L.1"/>
             <wp:cNvGraphicFramePr>
               <a:graphicFrameLocks xmlns:a="http://schemas.openxmlformats.org/drawingml/2006/main" noChangeAspect="1"/>
             </wp:cNvGraphicFramePr>
@@ -592,7 +592,7 @@
           <w:sz w:val="19"/>
           <w:szCs w:val="19"/>
         </w:rPr>
-        <w:t>Figure L.1 — The reader lab as a body. The ESP32-S3 is the brain; the sensors are its senses, the servo its muscle, the OLED its face, the LoRa radio its voice, and the 18650 cell its stomach. The labels on the links name the wiring each part uses.</w:t>
+        <w:t>Figure L.1 — The reader lab as a body. The ESP32-S3 is the brain; the sensors are its senses, the servo its muscle, the OLED its face, the LoRa radio its voice, and the 18650 cell its stomach. Link labels name interface types; this is a kit map, not a complete wiring diagram.</w:t>
       </w:r>
     </w:p>
     <w:p>

</xml_diff>